<commit_message>
update plans and word doc
</commit_message>
<xml_diff>
--- a/NEA_1.docx
+++ b/NEA_1.docx
@@ -156,6 +156,7 @@
                                     <w:dataBinding w:prefixMappings="xmlns:ns0='http://purl.org/dc/elements/1.1/' xmlns:ns1='http://schemas.openxmlformats.org/package/2006/metadata/core-properties' " w:xpath="/ns1:coreProperties[1]/ns0:subject[1]" w:storeItemID="{6C3C8BC8-F283-45AE-878A-BAB7291924A1}"/>
                                     <w:text/>
                                   </w:sdtPr>
+                                  <w:sdtEndPr/>
                                   <w:sdtContent>
                                     <w:r>
                                       <w:rPr>
@@ -270,6 +271,7 @@
                               <w:dataBinding w:prefixMappings="xmlns:ns0='http://purl.org/dc/elements/1.1/' xmlns:ns1='http://schemas.openxmlformats.org/package/2006/metadata/core-properties' " w:xpath="/ns1:coreProperties[1]/ns0:subject[1]" w:storeItemID="{6C3C8BC8-F283-45AE-878A-BAB7291924A1}"/>
                               <w:text/>
                             </w:sdtPr>
+                            <w:sdtEndPr/>
                             <w:sdtContent>
                               <w:r>
                                 <w:rPr>
@@ -910,6 +912,7 @@
                                     <w:dataBinding w:prefixMappings="xmlns:ns0='http://schemas.openxmlformats.org/officeDocument/2006/extended-properties' " w:xpath="/ns0:Properties[1]/ns0:Company[1]" w:storeItemID="{6668398D-A668-4E3E-A5EB-62B293D839F1}"/>
                                     <w:text/>
                                   </w:sdtPr>
+                                  <w:sdtEndPr/>
                                   <w:sdtContent>
                                     <w:r>
                                       <w:rPr>
@@ -936,6 +939,7 @@
                                   <w:dataBinding w:prefixMappings="xmlns:ns0='http://purl.org/dc/elements/1.1/' xmlns:ns1='http://schemas.openxmlformats.org/package/2006/metadata/core-properties' " w:xpath="/ns1:coreProperties[1]/ns1:category[1]" w:storeItemID="{6C3C8BC8-F283-45AE-878A-BAB7291924A1}"/>
                                   <w:text/>
                                 </w:sdtPr>
+                                <w:sdtEndPr/>
                                 <w:sdtContent>
                                   <w:p>
                                     <w:pPr>
@@ -1007,6 +1011,7 @@
                               <w:dataBinding w:prefixMappings="xmlns:ns0='http://schemas.openxmlformats.org/officeDocument/2006/extended-properties' " w:xpath="/ns0:Properties[1]/ns0:Company[1]" w:storeItemID="{6668398D-A668-4E3E-A5EB-62B293D839F1}"/>
                               <w:text/>
                             </w:sdtPr>
+                            <w:sdtEndPr/>
                             <w:sdtContent>
                               <w:r>
                                 <w:rPr>
@@ -1033,6 +1038,7 @@
                             <w:dataBinding w:prefixMappings="xmlns:ns0='http://purl.org/dc/elements/1.1/' xmlns:ns1='http://schemas.openxmlformats.org/package/2006/metadata/core-properties' " w:xpath="/ns1:coreProperties[1]/ns1:category[1]" w:storeItemID="{6C3C8BC8-F283-45AE-878A-BAB7291924A1}"/>
                             <w:text/>
                           </w:sdtPr>
+                          <w:sdtEndPr/>
                           <w:sdtContent>
                             <w:p>
                               <w:pPr>
@@ -1505,20 +1511,10 @@
       </w:pPr>
       <w:bookmarkStart w:id="0" w:name="_Toc228955320"/>
       <w:r>
+        <w:lastRenderedPageBreak/>
         <w:t>Analysis</w:t>
       </w:r>
       <w:bookmarkEnd w:id="0"/>
-    </w:p>
-    <w:p>
-      <w:r>
-        <w:t>H</w:t>
-      </w:r>
-      <w:r>
-        <w:t>ello</w:t>
-      </w:r>
-      <w:r>
-        <w:br w:type="page"/>
-      </w:r>
     </w:p>
     <w:p>
       <w:pPr>
@@ -1559,27 +1555,24 @@
         <w:t>.</w:t>
       </w:r>
     </w:p>
+    <w:p>
+      <w:r>
+        <w:t xml:space="preserve">My </w:t>
+      </w:r>
+      <w:r>
+        <w:t>program will allow people to tweak the settings</w:t>
+      </w:r>
+      <w:r>
+        <w:t xml:space="preserve"> of the simulation</w:t>
+      </w:r>
+      <w:r>
+        <w:t xml:space="preserve"> in real time, and provide an intuitive interface to alter these settings</w:t>
+      </w:r>
+      <w:r>
+        <w:t>.</w:t>
+      </w:r>
+    </w:p>
     <w:p/>
-    <w:p>
-      <w:r>
-        <w:t xml:space="preserve">My </w:t>
-      </w:r>
-      <w:r>
-        <w:t>program will allow people to tweak the settings</w:t>
-      </w:r>
-      <w:r>
-        <w:t xml:space="preserve"> of the simulation</w:t>
-      </w:r>
-      <w:r>
-        <w:t xml:space="preserve"> in real time, and provide an intuitive interface to alter these settings</w:t>
-      </w:r>
-      <w:r>
-        <w:t>.</w:t>
-      </w:r>
-      <w:r>
-        <w:br w:type="page"/>
-      </w:r>
-    </w:p>
     <w:p>
       <w:pPr>
         <w:pStyle w:val="Heading3"/>
@@ -1740,11 +1733,8 @@
         </w:tc>
       </w:tr>
     </w:tbl>
-    <w:p>
-      <w:r>
-        <w:br w:type="page"/>
-      </w:r>
-    </w:p>
+    <w:p/>
+    <w:p/>
     <w:p>
       <w:pPr>
         <w:pStyle w:val="Heading2"/>
@@ -1783,16 +1773,15 @@
       <w:r>
         <w:t>.</w:t>
       </w:r>
-      <w:r>
-        <w:br w:type="page"/>
-      </w:r>
     </w:p>
+    <w:p/>
     <w:p>
       <w:pPr>
         <w:pStyle w:val="Heading2"/>
       </w:pPr>
       <w:bookmarkStart w:id="4" w:name="_Toc228955324"/>
       <w:r>
+        <w:lastRenderedPageBreak/>
         <w:t>Research</w:t>
       </w:r>
       <w:bookmarkEnd w:id="4"/>
@@ -1841,11 +1830,6 @@
       </w:r>
       <w:r>
         <w:t xml:space="preserve"> them around the solar system and beyond.</w:t>
-      </w:r>
-    </w:p>
-    <w:p>
-      <w:r>
-        <w:t>Interesting elements:</w:t>
       </w:r>
     </w:p>
     <w:p>
@@ -1927,7 +1911,7 @@
                     <pic:cNvPicPr/>
                   </pic:nvPicPr>
                   <pic:blipFill>
-                    <a:blip r:embed="rId8" cstate="print">
+                    <a:blip r:embed="rId11" cstate="print">
                       <a:extLst>
                         <a:ext uri="{28A0092B-C50C-407E-A947-70E740481C1C}">
                           <a14:useLocalDpi xmlns:a14="http://schemas.microsoft.com/office/drawing/2010/main" val="0"/>
@@ -1961,27 +1945,14 @@
       <w:r>
         <w:t xml:space="preserve">Figure </w:t>
       </w:r>
-      <w:r>
-        <w:fldChar w:fldCharType="begin"/>
-      </w:r>
-      <w:r>
-        <w:instrText xml:space="preserve"> SEQ Figure \* ARABIC </w:instrText>
-      </w:r>
-      <w:r>
-        <w:fldChar w:fldCharType="separate"/>
-      </w:r>
-      <w:r>
-        <w:rPr>
-          <w:noProof/>
-        </w:rPr>
-        <w:t>1</w:t>
-      </w:r>
-      <w:r>
-        <w:rPr>
-          <w:noProof/>
-        </w:rPr>
-        <w:fldChar w:fldCharType="end"/>
-      </w:r>
+      <w:fldSimple w:instr=" SEQ Figure \* ARABIC ">
+        <w:r>
+          <w:rPr>
+            <w:noProof/>
+          </w:rPr>
+          <w:t>1</w:t>
+        </w:r>
+      </w:fldSimple>
       <w:r>
         <w:t xml:space="preserve"> showing orbital trajectories around the planet in KSP</w:t>
       </w:r>
@@ -2038,8 +2009,17 @@
       </w:r>
     </w:p>
     <w:p/>
+    <w:p/>
     <w:p>
       <w:r>
+        <w:t>&lt;insert pic of KSP interface here&gt;</w:t>
+      </w:r>
+    </w:p>
+    <w:p/>
+    <w:p/>
+    <w:p>
+      <w:r>
+        <w:lastRenderedPageBreak/>
         <w:t>Another</w:t>
       </w:r>
       <w:r>
@@ -2100,6 +2080,14 @@
         <w:t>.</w:t>
       </w:r>
     </w:p>
+    <w:p/>
+    <w:p/>
+    <w:p>
+      <w:r>
+        <w:t>&lt;insert picture of time warp in KSP&gt;</w:t>
+      </w:r>
+    </w:p>
+    <w:p/>
     <w:p/>
     <w:p>
       <w:pPr>
@@ -2228,46 +2216,22 @@
         <w:t xml:space="preserve"> I also hope to replicate the simplistic and modern </w:t>
       </w:r>
       <w:r>
-        <w:t>design each of the buttons have, while creating a consistent colour scheme to establish the navigation hierarchy and</w:t>
-      </w:r>
-      <w:r>
-        <w:t xml:space="preserve"> make the whole project more cohesive.</w:t>
-      </w:r>
-    </w:p>
-    <w:p/>
-    <w:p>
-      <w:r>
-        <w:t xml:space="preserve">I will not be </w:t>
-      </w:r>
-      <w:r>
-        <w:t>implementing</w:t>
-      </w:r>
-      <w:r>
-        <w:t xml:space="preserve"> the </w:t>
-      </w:r>
-      <w:r>
-        <w:t xml:space="preserve">idea of zooming in or out to my simulation to reduce </w:t>
-      </w:r>
-      <w:r>
-        <w:t xml:space="preserve">the </w:t>
-      </w:r>
-      <w:r>
-        <w:t>complexity</w:t>
-      </w:r>
-      <w:r>
-        <w:t xml:space="preserve"> of the project, however I will allow users to define the </w:t>
-      </w:r>
-      <w:r>
-        <w:t xml:space="preserve">scale of the canvas to allow </w:t>
-      </w:r>
-      <w:r>
-        <w:t>f</w:t>
-      </w:r>
-      <w:r>
-        <w:t xml:space="preserve">or </w:t>
-      </w:r>
-      <w:r>
-        <w:t>simulations on different scales</w:t>
+        <w:t>design each of the buttons have, while creating a consistent</w:t>
+      </w:r>
+      <w:r>
+        <w:t xml:space="preserve"> </w:t>
+      </w:r>
+      <w:r>
+        <w:t>colour scheme to establish the navigation hierarchy and</w:t>
+      </w:r>
+      <w:r>
+        <w:t xml:space="preserve"> make the whole project more</w:t>
+      </w:r>
+      <w:r>
+        <w:t xml:space="preserve"> </w:t>
+      </w:r>
+      <w:r>
+        <w:t>cohesive</w:t>
       </w:r>
       <w:r>
         <w:t>.</w:t>
@@ -2277,18 +2241,169 @@
       <w:r>
         <w:rPr>
           <w:noProof/>
-          <w:color w:val="FF0000"/>
+        </w:rPr>
+        <w:lastRenderedPageBreak/>
+        <mc:AlternateContent>
+          <mc:Choice Requires="wps">
+            <w:drawing>
+              <wp:anchor distT="0" distB="0" distL="114300" distR="114300" simplePos="0" relativeHeight="251660304" behindDoc="0" locked="0" layoutInCell="1" allowOverlap="1" wp14:anchorId="07BE2A46" wp14:editId="51958231">
+                <wp:simplePos x="0" y="0"/>
+                <wp:positionH relativeFrom="column">
+                  <wp:posOffset>1302385</wp:posOffset>
+                </wp:positionH>
+                <wp:positionV relativeFrom="paragraph">
+                  <wp:posOffset>2008427</wp:posOffset>
+                </wp:positionV>
+                <wp:extent cx="323850" cy="366395"/>
+                <wp:effectExtent l="0" t="0" r="19050" b="33655"/>
+                <wp:wrapNone/>
+                <wp:docPr id="1631677002" name="Straight Connector 10"/>
+                <wp:cNvGraphicFramePr/>
+                <a:graphic xmlns:a="http://schemas.openxmlformats.org/drawingml/2006/main">
+                  <a:graphicData uri="http://schemas.microsoft.com/office/word/2010/wordprocessingShape">
+                    <wps:wsp>
+                      <wps:cNvCnPr/>
+                      <wps:spPr>
+                        <a:xfrm flipV="1">
+                          <a:off x="0" y="0"/>
+                          <a:ext cx="323850" cy="366395"/>
+                        </a:xfrm>
+                        <a:prstGeom prst="line">
+                          <a:avLst/>
+                        </a:prstGeom>
+                        <a:ln w="9525">
+                          <a:solidFill>
+                            <a:srgbClr val="EE0000"/>
+                          </a:solidFill>
+                        </a:ln>
+                      </wps:spPr>
+                      <wps:style>
+                        <a:lnRef idx="2">
+                          <a:schemeClr val="dk1"/>
+                        </a:lnRef>
+                        <a:fillRef idx="0">
+                          <a:schemeClr val="dk1"/>
+                        </a:fillRef>
+                        <a:effectRef idx="1">
+                          <a:schemeClr val="dk1"/>
+                        </a:effectRef>
+                        <a:fontRef idx="minor">
+                          <a:schemeClr val="tx1"/>
+                        </a:fontRef>
+                      </wps:style>
+                      <wps:bodyPr/>
+                    </wps:wsp>
+                  </a:graphicData>
+                </a:graphic>
+                <wp14:sizeRelH relativeFrom="margin">
+                  <wp14:pctWidth>0</wp14:pctWidth>
+                </wp14:sizeRelH>
+                <wp14:sizeRelV relativeFrom="margin">
+                  <wp14:pctHeight>0</wp14:pctHeight>
+                </wp14:sizeRelV>
+              </wp:anchor>
+            </w:drawing>
+          </mc:Choice>
+          <mc:Fallback>
+            <w:pict>
+              <v:line w14:anchorId="3640264C" id="Straight Connector 10" o:spid="_x0000_s1026" style="position:absolute;flip:y;z-index:251660304;visibility:visible;mso-wrap-style:square;mso-width-percent:0;mso-height-percent:0;mso-wrap-distance-left:9pt;mso-wrap-distance-top:0;mso-wrap-distance-right:9pt;mso-wrap-distance-bottom:0;mso-position-horizontal:absolute;mso-position-horizontal-relative:text;mso-position-vertical:absolute;mso-position-vertical-relative:text;mso-width-percent:0;mso-height-percent:0;mso-width-relative:margin;mso-height-relative:margin" from="102.55pt,158.15pt" to="128.05pt,187pt" o:gfxdata="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" strokecolor="#e00">
+                <v:stroke joinstyle="miter"/>
+              </v:line>
+            </w:pict>
+          </mc:Fallback>
+        </mc:AlternateContent>
+      </w:r>
+      <w:r>
+        <w:rPr>
+          <w:noProof/>
         </w:rPr>
         <mc:AlternateContent>
           <mc:Choice Requires="wps">
             <w:drawing>
-              <wp:anchor distT="0" distB="0" distL="114300" distR="114300" simplePos="0" relativeHeight="251658255" behindDoc="0" locked="0" layoutInCell="1" allowOverlap="1" wp14:anchorId="0033C87E" wp14:editId="5D36F1BD">
+              <wp:anchor distT="0" distB="0" distL="114300" distR="114300" simplePos="0" relativeHeight="251658248" behindDoc="0" locked="0" layoutInCell="1" allowOverlap="1" wp14:anchorId="18BA0517" wp14:editId="0B34EA59">
                 <wp:simplePos x="0" y="0"/>
                 <wp:positionH relativeFrom="column">
-                  <wp:posOffset>4305300</wp:posOffset>
+                  <wp:posOffset>1033832</wp:posOffset>
                 </wp:positionH>
                 <wp:positionV relativeFrom="paragraph">
-                  <wp:posOffset>743162</wp:posOffset>
+                  <wp:posOffset>1515291</wp:posOffset>
+                </wp:positionV>
+                <wp:extent cx="1324610" cy="490791"/>
+                <wp:effectExtent l="0" t="0" r="27940" b="24130"/>
+                <wp:wrapNone/>
+                <wp:docPr id="576936195" name="Rectangle 11"/>
+                <wp:cNvGraphicFramePr/>
+                <a:graphic xmlns:a="http://schemas.openxmlformats.org/drawingml/2006/main">
+                  <a:graphicData uri="http://schemas.microsoft.com/office/word/2010/wordprocessingShape">
+                    <wps:wsp>
+                      <wps:cNvSpPr/>
+                      <wps:spPr>
+                        <a:xfrm>
+                          <a:off x="0" y="0"/>
+                          <a:ext cx="1324610" cy="490791"/>
+                        </a:xfrm>
+                        <a:prstGeom prst="rect">
+                          <a:avLst/>
+                        </a:prstGeom>
+                        <a:noFill/>
+                        <a:ln>
+                          <a:solidFill>
+                            <a:srgbClr val="EE0000"/>
+                          </a:solidFill>
+                        </a:ln>
+                      </wps:spPr>
+                      <wps:style>
+                        <a:lnRef idx="2">
+                          <a:schemeClr val="accent1">
+                            <a:shade val="15000"/>
+                          </a:schemeClr>
+                        </a:lnRef>
+                        <a:fillRef idx="1">
+                          <a:schemeClr val="accent1"/>
+                        </a:fillRef>
+                        <a:effectRef idx="0">
+                          <a:schemeClr val="accent1"/>
+                        </a:effectRef>
+                        <a:fontRef idx="minor">
+                          <a:schemeClr val="lt1"/>
+                        </a:fontRef>
+                      </wps:style>
+                      <wps:bodyPr rot="0" spcFirstLastPara="0" vertOverflow="overflow" horzOverflow="overflow" vert="horz" wrap="square" lIns="91440" tIns="45720" rIns="91440" bIns="45720" numCol="1" spcCol="0" rtlCol="0" fromWordArt="0" anchor="ctr" anchorCtr="0" forceAA="0" compatLnSpc="1">
+                        <a:prstTxWarp prst="textNoShape">
+                          <a:avLst/>
+                        </a:prstTxWarp>
+                        <a:noAutofit/>
+                      </wps:bodyPr>
+                    </wps:wsp>
+                  </a:graphicData>
+                </a:graphic>
+                <wp14:sizeRelV relativeFrom="margin">
+                  <wp14:pctHeight>0</wp14:pctHeight>
+                </wp14:sizeRelV>
+              </wp:anchor>
+            </w:drawing>
+          </mc:Choice>
+          <mc:Fallback>
+            <w:pict>
+              <v:rect w14:anchorId="259FE43E" id="Rectangle 11" o:spid="_x0000_s1026" style="position:absolute;margin-left:81.4pt;margin-top:119.3pt;width:104.3pt;height:38.65pt;z-index:251658248;visibility:visible;mso-wrap-style:square;mso-height-percent:0;mso-wrap-distance-left:9pt;mso-wrap-distance-top:0;mso-wrap-distance-right:9pt;mso-wrap-distance-bottom:0;mso-position-horizontal:absolute;mso-position-horizontal-relative:text;mso-position-vertical:absolute;mso-position-vertical-relative:text;mso-height-percent:0;mso-height-relative:margin;v-text-anchor:middle" o:gfxdata="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" filled="f" strokecolor="#e00" strokeweight="1.5pt"/>
+            </w:pict>
+          </mc:Fallback>
+        </mc:AlternateContent>
+      </w:r>
+      <w:r>
+        <w:rPr>
+          <w:noProof/>
+        </w:rPr>
+        <mc:AlternateContent>
+          <mc:Choice Requires="wps">
+            <w:drawing>
+              <wp:anchor distT="0" distB="0" distL="114300" distR="114300" simplePos="0" relativeHeight="251658255" behindDoc="0" locked="0" layoutInCell="1" allowOverlap="1" wp14:anchorId="0033C87E" wp14:editId="1FFD66ED">
+                <wp:simplePos x="0" y="0"/>
+                <wp:positionH relativeFrom="column">
+                  <wp:posOffset>4142740</wp:posOffset>
+                </wp:positionH>
+                <wp:positionV relativeFrom="paragraph">
+                  <wp:posOffset>828675</wp:posOffset>
                 </wp:positionV>
                 <wp:extent cx="355600" cy="76200"/>
                 <wp:effectExtent l="0" t="0" r="25400" b="19050"/>
@@ -2340,9 +2455,9 @@
               </wp:anchor>
             </w:drawing>
           </mc:Choice>
-          <mc:Fallback xmlns:arto="http://schemas.microsoft.com/office/word/2006/arto">
+          <mc:Fallback>
             <w:pict>
-              <v:line w14:anchorId="2F86481A" id="Straight Connector 10" o:spid="_x0000_s1026" style="position:absolute;flip:x y;z-index:251684864;visibility:visible;mso-wrap-style:square;mso-width-percent:0;mso-height-percent:0;mso-wrap-distance-left:9pt;mso-wrap-distance-top:0;mso-wrap-distance-right:9pt;mso-wrap-distance-bottom:0;mso-position-horizontal:absolute;mso-position-horizontal-relative:text;mso-position-vertical:absolute;mso-position-vertical-relative:text;mso-width-percent:0;mso-height-percent:0;mso-width-relative:margin;mso-height-relative:margin" from="339pt,58.5pt" to="367pt,64.5pt" o:gfxdata="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" strokecolor="#e00">
+              <v:line w14:anchorId="551EA6DA" id="Straight Connector 10" o:spid="_x0000_s1026" style="position:absolute;flip:x y;z-index:251658255;visibility:visible;mso-wrap-style:square;mso-width-percent:0;mso-height-percent:0;mso-wrap-distance-left:9pt;mso-wrap-distance-top:0;mso-wrap-distance-right:9pt;mso-wrap-distance-bottom:0;mso-position-horizontal:absolute;mso-position-horizontal-relative:text;mso-position-vertical:absolute;mso-position-vertical-relative:text;mso-width-percent:0;mso-height-percent:0;mso-width-relative:margin;mso-height-relative:margin" from="326.2pt,65.25pt" to="354.2pt,71.25pt" o:gfxdata="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" strokecolor="#e00">
                 <v:stroke joinstyle="miter"/>
               </v:line>
             </w:pict>
@@ -2356,13 +2471,13 @@
         <mc:AlternateContent>
           <mc:Choice Requires="wps">
             <w:drawing>
-              <wp:anchor distT="45720" distB="45720" distL="114300" distR="114300" simplePos="0" relativeHeight="251658254" behindDoc="0" locked="0" layoutInCell="1" allowOverlap="1" wp14:anchorId="2F63DED6" wp14:editId="480EE5CD">
+              <wp:anchor distT="45720" distB="45720" distL="114300" distR="114300" simplePos="0" relativeHeight="251658254" behindDoc="0" locked="0" layoutInCell="1" allowOverlap="1" wp14:anchorId="2F63DED6" wp14:editId="7DD99A32">
                 <wp:simplePos x="0" y="0"/>
                 <wp:positionH relativeFrom="column">
-                  <wp:posOffset>4660900</wp:posOffset>
+                  <wp:posOffset>4498340</wp:posOffset>
                 </wp:positionH>
                 <wp:positionV relativeFrom="paragraph">
-                  <wp:posOffset>531495</wp:posOffset>
+                  <wp:posOffset>617220</wp:posOffset>
                 </wp:positionV>
                 <wp:extent cx="1282700" cy="562610"/>
                 <wp:effectExtent l="0" t="0" r="12700" b="27940"/>
@@ -2440,7 +2555,7 @@
           </mc:Choice>
           <mc:Fallback>
             <w:pict>
-              <v:shape w14:anchorId="2F63DED6" id="Text Box 2" o:spid="_x0000_s1028" type="#_x0000_t202" style="position:absolute;margin-left:367pt;margin-top:41.85pt;width:101pt;height:44.3pt;z-index:251658254;visibility:visible;mso-wrap-style:square;mso-width-percent:0;mso-height-percent:0;mso-wrap-distance-left:9pt;mso-wrap-distance-top:3.6pt;mso-wrap-distance-right:9pt;mso-wrap-distance-bottom:3.6pt;mso-position-horizontal:absolute;mso-position-horizontal-relative:text;mso-position-vertical:absolute;mso-position-vertical-relative:text;mso-width-percent:0;mso-height-percent:0;mso-width-relative:margin;mso-height-relative:margin;v-text-anchor:top" o:gfxdata="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" strokecolor="#e00">
+              <v:shape w14:anchorId="2F63DED6" id="Text Box 2" o:spid="_x0000_s1028" type="#_x0000_t202" style="position:absolute;margin-left:354.2pt;margin-top:48.6pt;width:101pt;height:44.3pt;z-index:251658254;visibility:visible;mso-wrap-style:square;mso-width-percent:0;mso-height-percent:0;mso-wrap-distance-left:9pt;mso-wrap-distance-top:3.6pt;mso-wrap-distance-right:9pt;mso-wrap-distance-bottom:3.6pt;mso-position-horizontal:absolute;mso-position-horizontal-relative:text;mso-position-vertical:absolute;mso-position-vertical-relative:text;mso-width-percent:0;mso-height-percent:0;mso-width-relative:margin;mso-height-relative:margin;v-text-anchor:top" o:gfxdata="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" strokecolor="#e00">
                 <v:textbox>
                   <w:txbxContent>
                     <w:p>
@@ -2476,20 +2591,19 @@
       <w:r>
         <w:rPr>
           <w:noProof/>
-          <w:color w:val="FF0000"/>
         </w:rPr>
         <mc:AlternateContent>
           <mc:Choice Requires="wps">
             <w:drawing>
-              <wp:anchor distT="0" distB="0" distL="114300" distR="114300" simplePos="0" relativeHeight="251658253" behindDoc="0" locked="0" layoutInCell="1" allowOverlap="1" wp14:anchorId="48995FCB" wp14:editId="04AD014A">
+              <wp:anchor distT="0" distB="0" distL="114300" distR="114300" simplePos="0" relativeHeight="251658253" behindDoc="0" locked="0" layoutInCell="1" allowOverlap="1" wp14:anchorId="48995FCB" wp14:editId="5F16842D">
                 <wp:simplePos x="0" y="0"/>
                 <wp:positionH relativeFrom="column">
-                  <wp:posOffset>3712633</wp:posOffset>
+                  <wp:posOffset>3549650</wp:posOffset>
                 </wp:positionH>
                 <wp:positionV relativeFrom="paragraph">
-                  <wp:posOffset>489161</wp:posOffset>
+                  <wp:posOffset>574675</wp:posOffset>
                 </wp:positionV>
-                <wp:extent cx="593090" cy="537633"/>
+                <wp:extent cx="593090" cy="537210"/>
                 <wp:effectExtent l="0" t="0" r="16510" b="15240"/>
                 <wp:wrapNone/>
                 <wp:docPr id="654511524" name="Rectangle 11"/>
@@ -2501,7 +2615,7 @@
                       <wps:spPr>
                         <a:xfrm>
                           <a:off x="0" y="0"/>
-                          <a:ext cx="593090" cy="537633"/>
+                          <a:ext cx="593090" cy="537210"/>
                         </a:xfrm>
                         <a:prstGeom prst="rect">
                           <a:avLst/>
@@ -2547,9 +2661,9 @@
               </wp:anchor>
             </w:drawing>
           </mc:Choice>
-          <mc:Fallback xmlns:arto="http://schemas.microsoft.com/office/word/2006/arto">
+          <mc:Fallback>
             <w:pict>
-              <v:rect w14:anchorId="73AB53DC" id="Rectangle 11" o:spid="_x0000_s1026" style="position:absolute;margin-left:292.35pt;margin-top:38.5pt;width:46.7pt;height:42.35pt;z-index:251680768;visibility:visible;mso-wrap-style:square;mso-width-percent:0;mso-height-percent:0;mso-wrap-distance-left:9pt;mso-wrap-distance-top:0;mso-wrap-distance-right:9pt;mso-wrap-distance-bottom:0;mso-position-horizontal:absolute;mso-position-horizontal-relative:text;mso-position-vertical:absolute;mso-position-vertical-relative:text;mso-width-percent:0;mso-height-percent:0;mso-width-relative:margin;mso-height-relative:margin;v-text-anchor:middle" o:gfxdata="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" filled="f" strokecolor="#e00" strokeweight="1.5pt"/>
+              <v:rect w14:anchorId="79370E73" id="Rectangle 11" o:spid="_x0000_s1026" style="position:absolute;margin-left:279.5pt;margin-top:45.25pt;width:46.7pt;height:42.3pt;z-index:251658253;visibility:visible;mso-wrap-style:square;mso-width-percent:0;mso-height-percent:0;mso-wrap-distance-left:9pt;mso-wrap-distance-top:0;mso-wrap-distance-right:9pt;mso-wrap-distance-bottom:0;mso-position-horizontal:absolute;mso-position-horizontal-relative:text;mso-position-vertical:absolute;mso-position-vertical-relative:text;mso-width-percent:0;mso-height-percent:0;mso-width-relative:margin;mso-height-relative:margin;v-text-anchor:middle" o:gfxdata="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" filled="f" strokecolor="#e00" strokeweight="1.5pt"/>
             </w:pict>
           </mc:Fallback>
         </mc:AlternateContent>
@@ -2557,20 +2671,19 @@
       <w:r>
         <w:rPr>
           <w:noProof/>
-          <w:color w:val="FF0000"/>
         </w:rPr>
         <mc:AlternateContent>
           <mc:Choice Requires="wps">
             <w:drawing>
-              <wp:anchor distT="0" distB="0" distL="114300" distR="114300" simplePos="0" relativeHeight="251658251" behindDoc="0" locked="0" layoutInCell="1" allowOverlap="1" wp14:anchorId="3FDB338B" wp14:editId="6376D6B8">
+              <wp:anchor distT="0" distB="0" distL="114300" distR="114300" simplePos="0" relativeHeight="251658251" behindDoc="0" locked="0" layoutInCell="1" allowOverlap="1" wp14:anchorId="3FDB338B" wp14:editId="3560D6A0">
                 <wp:simplePos x="0" y="0"/>
                 <wp:positionH relativeFrom="column">
-                  <wp:posOffset>4305722</wp:posOffset>
+                  <wp:posOffset>4142740</wp:posOffset>
                 </wp:positionH>
                 <wp:positionV relativeFrom="paragraph">
-                  <wp:posOffset>1395094</wp:posOffset>
+                  <wp:posOffset>1480185</wp:posOffset>
                 </wp:positionV>
-                <wp:extent cx="354965" cy="190077"/>
+                <wp:extent cx="354965" cy="189865"/>
                 <wp:effectExtent l="0" t="0" r="26035" b="19685"/>
                 <wp:wrapNone/>
                 <wp:docPr id="1364353164" name="Straight Connector 10"/>
@@ -2582,7 +2695,7 @@
                       <wps:spPr>
                         <a:xfrm flipH="1" flipV="1">
                           <a:off x="0" y="0"/>
-                          <a:ext cx="354965" cy="190077"/>
+                          <a:ext cx="354965" cy="189865"/>
                         </a:xfrm>
                         <a:prstGeom prst="line">
                           <a:avLst/>
@@ -2620,9 +2733,9 @@
               </wp:anchor>
             </w:drawing>
           </mc:Choice>
-          <mc:Fallback xmlns:arto="http://schemas.microsoft.com/office/word/2006/arto">
+          <mc:Fallback>
             <w:pict>
-              <v:line w14:anchorId="7340EB22" id="Straight Connector 10" o:spid="_x0000_s1026" style="position:absolute;flip:x y;z-index:251676672;visibility:visible;mso-wrap-style:square;mso-width-percent:0;mso-height-percent:0;mso-wrap-distance-left:9pt;mso-wrap-distance-top:0;mso-wrap-distance-right:9pt;mso-wrap-distance-bottom:0;mso-position-horizontal:absolute;mso-position-horizontal-relative:text;mso-position-vertical:absolute;mso-position-vertical-relative:text;mso-width-percent:0;mso-height-percent:0;mso-width-relative:margin;mso-height-relative:margin" from="339.05pt,109.85pt" to="367pt,124.8pt" o:gfxdata="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" strokecolor="#e00">
+              <v:line w14:anchorId="63874074" id="Straight Connector 10" o:spid="_x0000_s1026" style="position:absolute;flip:x y;z-index:251658251;visibility:visible;mso-wrap-style:square;mso-width-percent:0;mso-height-percent:0;mso-wrap-distance-left:9pt;mso-wrap-distance-top:0;mso-wrap-distance-right:9pt;mso-wrap-distance-bottom:0;mso-position-horizontal:absolute;mso-position-horizontal-relative:text;mso-position-vertical:absolute;mso-position-vertical-relative:text;mso-width-percent:0;mso-height-percent:0;mso-width-relative:margin;mso-height-relative:margin" from="326.2pt,116.55pt" to="354.15pt,131.5pt" o:gfxdata="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" strokecolor="#e00">
                 <v:stroke joinstyle="miter"/>
               </v:line>
             </w:pict>
@@ -2632,18 +2745,17 @@
       <w:r>
         <w:rPr>
           <w:noProof/>
-          <w:color w:val="FF0000"/>
         </w:rPr>
         <mc:AlternateContent>
           <mc:Choice Requires="wps">
             <w:drawing>
-              <wp:anchor distT="0" distB="0" distL="114300" distR="114300" simplePos="0" relativeHeight="251658252" behindDoc="0" locked="0" layoutInCell="1" allowOverlap="1" wp14:anchorId="5FFB09D3" wp14:editId="1A2A45B8">
+              <wp:anchor distT="0" distB="0" distL="114300" distR="114300" simplePos="0" relativeHeight="251658252" behindDoc="0" locked="0" layoutInCell="1" allowOverlap="1" wp14:anchorId="5FFB09D3" wp14:editId="77A5F97B">
                 <wp:simplePos x="0" y="0"/>
                 <wp:positionH relativeFrom="column">
-                  <wp:posOffset>3712633</wp:posOffset>
+                  <wp:posOffset>3549650</wp:posOffset>
                 </wp:positionH>
                 <wp:positionV relativeFrom="paragraph">
-                  <wp:posOffset>1026795</wp:posOffset>
+                  <wp:posOffset>1112520</wp:posOffset>
                 </wp:positionV>
                 <wp:extent cx="593090" cy="736600"/>
                 <wp:effectExtent l="0" t="0" r="16510" b="25400"/>
@@ -2703,9 +2815,9 @@
               </wp:anchor>
             </w:drawing>
           </mc:Choice>
-          <mc:Fallback xmlns:arto="http://schemas.microsoft.com/office/word/2006/arto">
+          <mc:Fallback>
             <w:pict>
-              <v:rect w14:anchorId="4DC1B5D0" id="Rectangle 11" o:spid="_x0000_s1026" style="position:absolute;margin-left:292.35pt;margin-top:80.85pt;width:46.7pt;height:58pt;z-index:251678720;visibility:visible;mso-wrap-style:square;mso-width-percent:0;mso-height-percent:0;mso-wrap-distance-left:9pt;mso-wrap-distance-top:0;mso-wrap-distance-right:9pt;mso-wrap-distance-bottom:0;mso-position-horizontal:absolute;mso-position-horizontal-relative:text;mso-position-vertical:absolute;mso-position-vertical-relative:text;mso-width-percent:0;mso-height-percent:0;mso-width-relative:margin;mso-height-relative:margin;v-text-anchor:middle" o:gfxdata="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" filled="f" strokecolor="#e00" strokeweight="1.5pt"/>
+              <v:rect w14:anchorId="3AF5D4C1" id="Rectangle 11" o:spid="_x0000_s1026" style="position:absolute;margin-left:279.5pt;margin-top:87.6pt;width:46.7pt;height:58pt;z-index:251658252;visibility:visible;mso-wrap-style:square;mso-width-percent:0;mso-height-percent:0;mso-wrap-distance-left:9pt;mso-wrap-distance-top:0;mso-wrap-distance-right:9pt;mso-wrap-distance-bottom:0;mso-position-horizontal:absolute;mso-position-horizontal-relative:text;mso-position-vertical:absolute;mso-position-vertical-relative:text;mso-width-percent:0;mso-height-percent:0;mso-width-relative:margin;mso-height-relative:margin;v-text-anchor:middle" o:gfxdata="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" filled="f" strokecolor="#e00" strokeweight="1.5pt"/>
             </w:pict>
           </mc:Fallback>
         </mc:AlternateContent>
@@ -2713,20 +2825,19 @@
       <w:r>
         <w:rPr>
           <w:noProof/>
-          <w:color w:val="FF0000"/>
         </w:rPr>
         <mc:AlternateContent>
           <mc:Choice Requires="wps">
             <w:drawing>
-              <wp:anchor distT="0" distB="0" distL="114300" distR="114300" simplePos="0" relativeHeight="251658247" behindDoc="0" locked="0" layoutInCell="1" allowOverlap="1" wp14:anchorId="122353A0" wp14:editId="2371BEF8">
+              <wp:anchor distT="0" distB="0" distL="114300" distR="114300" simplePos="0" relativeHeight="251658247" behindDoc="0" locked="0" layoutInCell="1" allowOverlap="1" wp14:anchorId="122353A0" wp14:editId="46BDBA6E">
                 <wp:simplePos x="0" y="0"/>
                 <wp:positionH relativeFrom="column">
-                  <wp:posOffset>2523067</wp:posOffset>
+                  <wp:posOffset>2360295</wp:posOffset>
                 </wp:positionH>
                 <wp:positionV relativeFrom="paragraph">
-                  <wp:posOffset>1927860</wp:posOffset>
+                  <wp:posOffset>2013585</wp:posOffset>
                 </wp:positionV>
-                <wp:extent cx="67733" cy="340572"/>
+                <wp:extent cx="67310" cy="340360"/>
                 <wp:effectExtent l="0" t="0" r="27940" b="21590"/>
                 <wp:wrapNone/>
                 <wp:docPr id="742996675" name="Straight Connector 10"/>
@@ -2738,7 +2849,7 @@
                       <wps:spPr>
                         <a:xfrm flipV="1">
                           <a:off x="0" y="0"/>
-                          <a:ext cx="67733" cy="340572"/>
+                          <a:ext cx="67310" cy="340360"/>
                         </a:xfrm>
                         <a:prstGeom prst="line">
                           <a:avLst/>
@@ -2776,84 +2887,9 @@
               </wp:anchor>
             </w:drawing>
           </mc:Choice>
-          <mc:Fallback xmlns:arto="http://schemas.microsoft.com/office/word/2006/arto">
+          <mc:Fallback>
             <w:pict>
-              <v:line w14:anchorId="1716D6E9" id="Straight Connector 10" o:spid="_x0000_s1026" style="position:absolute;flip:y;z-index:251669504;visibility:visible;mso-wrap-style:square;mso-width-percent:0;mso-height-percent:0;mso-wrap-distance-left:9pt;mso-wrap-distance-top:0;mso-wrap-distance-right:9pt;mso-wrap-distance-bottom:0;mso-position-horizontal:absolute;mso-position-horizontal-relative:text;mso-position-vertical:absolute;mso-position-vertical-relative:text;mso-width-percent:0;mso-height-percent:0;mso-width-relative:margin;mso-height-relative:margin" from="198.65pt,151.8pt" to="204pt,178.6pt" o:gfxdata="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" strokecolor="#e00">
-                <v:stroke joinstyle="miter"/>
-              </v:line>
-            </w:pict>
-          </mc:Fallback>
-        </mc:AlternateContent>
-      </w:r>
-      <w:r>
-        <w:rPr>
-          <w:noProof/>
-          <w:color w:val="FF0000"/>
-        </w:rPr>
-        <mc:AlternateContent>
-          <mc:Choice Requires="wps">
-            <w:drawing>
-              <wp:anchor distT="0" distB="0" distL="114300" distR="114300" simplePos="0" relativeHeight="251658246" behindDoc="0" locked="0" layoutInCell="1" allowOverlap="1" wp14:anchorId="36560BE9" wp14:editId="794D8EF5">
-                <wp:simplePos x="0" y="0"/>
-                <wp:positionH relativeFrom="column">
-                  <wp:posOffset>1464733</wp:posOffset>
-                </wp:positionH>
-                <wp:positionV relativeFrom="paragraph">
-                  <wp:posOffset>1898862</wp:posOffset>
-                </wp:positionV>
-                <wp:extent cx="131234" cy="195368"/>
-                <wp:effectExtent l="0" t="0" r="21590" b="33655"/>
-                <wp:wrapNone/>
-                <wp:docPr id="1914306035" name="Straight Connector 10"/>
-                <wp:cNvGraphicFramePr/>
-                <a:graphic xmlns:a="http://schemas.openxmlformats.org/drawingml/2006/main">
-                  <a:graphicData uri="http://schemas.microsoft.com/office/word/2010/wordprocessingShape">
-                    <wps:wsp>
-                      <wps:cNvCnPr/>
-                      <wps:spPr>
-                        <a:xfrm flipV="1">
-                          <a:off x="0" y="0"/>
-                          <a:ext cx="131234" cy="195368"/>
-                        </a:xfrm>
-                        <a:prstGeom prst="line">
-                          <a:avLst/>
-                        </a:prstGeom>
-                        <a:ln w="9525">
-                          <a:solidFill>
-                            <a:srgbClr val="EE0000"/>
-                          </a:solidFill>
-                        </a:ln>
-                      </wps:spPr>
-                      <wps:style>
-                        <a:lnRef idx="2">
-                          <a:schemeClr val="dk1"/>
-                        </a:lnRef>
-                        <a:fillRef idx="0">
-                          <a:schemeClr val="dk1"/>
-                        </a:fillRef>
-                        <a:effectRef idx="1">
-                          <a:schemeClr val="dk1"/>
-                        </a:effectRef>
-                        <a:fontRef idx="minor">
-                          <a:schemeClr val="tx1"/>
-                        </a:fontRef>
-                      </wps:style>
-                      <wps:bodyPr/>
-                    </wps:wsp>
-                  </a:graphicData>
-                </a:graphic>
-                <wp14:sizeRelH relativeFrom="margin">
-                  <wp14:pctWidth>0</wp14:pctWidth>
-                </wp14:sizeRelH>
-                <wp14:sizeRelV relativeFrom="margin">
-                  <wp14:pctHeight>0</wp14:pctHeight>
-                </wp14:sizeRelV>
-              </wp:anchor>
-            </w:drawing>
-          </mc:Choice>
-          <mc:Fallback xmlns:arto="http://schemas.microsoft.com/office/word/2006/arto">
-            <w:pict>
-              <v:line w14:anchorId="1EE89BA7" id="Straight Connector 10" o:spid="_x0000_s1026" style="position:absolute;flip:y;z-index:251667456;visibility:visible;mso-wrap-style:square;mso-width-percent:0;mso-height-percent:0;mso-wrap-distance-left:9pt;mso-wrap-distance-top:0;mso-wrap-distance-right:9pt;mso-wrap-distance-bottom:0;mso-position-horizontal:absolute;mso-position-horizontal-relative:text;mso-position-vertical:absolute;mso-position-vertical-relative:text;mso-width-percent:0;mso-height-percent:0;mso-width-relative:margin;mso-height-relative:margin" from="115.35pt,149.5pt" to="125.7pt,164.9pt" o:gfxdata="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" strokecolor="#e00">
+              <v:line w14:anchorId="23BBDB8F" id="Straight Connector 10" o:spid="_x0000_s1026" style="position:absolute;flip:y;z-index:251658247;visibility:visible;mso-wrap-style:square;mso-width-percent:0;mso-height-percent:0;mso-wrap-distance-left:9pt;mso-wrap-distance-top:0;mso-wrap-distance-right:9pt;mso-wrap-distance-bottom:0;mso-position-horizontal:absolute;mso-position-horizontal-relative:text;mso-position-vertical:absolute;mso-position-vertical-relative:text;mso-width-percent:0;mso-height-percent:0;mso-width-relative:margin;mso-height-relative:margin" from="185.85pt,158.55pt" to="191.15pt,185.35pt" o:gfxdata="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" strokecolor="#e00">
                 <v:stroke joinstyle="miter"/>
               </v:line>
             </w:pict>
@@ -2867,13 +2903,13 @@
         <mc:AlternateContent>
           <mc:Choice Requires="wps">
             <w:drawing>
-              <wp:anchor distT="45720" distB="45720" distL="114300" distR="114300" simplePos="0" relativeHeight="251658250" behindDoc="0" locked="0" layoutInCell="1" allowOverlap="1" wp14:anchorId="6B276C74" wp14:editId="6A1A03A4">
+              <wp:anchor distT="45720" distB="45720" distL="114300" distR="114300" simplePos="0" relativeHeight="251658250" behindDoc="0" locked="0" layoutInCell="1" allowOverlap="1" wp14:anchorId="6B276C74" wp14:editId="79121BB4">
                 <wp:simplePos x="0" y="0"/>
                 <wp:positionH relativeFrom="column">
-                  <wp:posOffset>4660265</wp:posOffset>
+                  <wp:posOffset>4497705</wp:posOffset>
                 </wp:positionH>
                 <wp:positionV relativeFrom="paragraph">
-                  <wp:posOffset>1297305</wp:posOffset>
+                  <wp:posOffset>1383030</wp:posOffset>
                 </wp:positionV>
                 <wp:extent cx="1388110" cy="605155"/>
                 <wp:effectExtent l="0" t="0" r="21590" b="23495"/>
@@ -2979,7 +3015,7 @@
           </mc:Choice>
           <mc:Fallback>
             <w:pict>
-              <v:shape w14:anchorId="6B276C74" id="_x0000_s1029" type="#_x0000_t202" style="position:absolute;margin-left:366.95pt;margin-top:102.15pt;width:109.3pt;height:47.65pt;z-index:251658250;visibility:visible;mso-wrap-style:square;mso-width-percent:0;mso-height-percent:0;mso-wrap-distance-left:9pt;mso-wrap-distance-top:3.6pt;mso-wrap-distance-right:9pt;mso-wrap-distance-bottom:3.6pt;mso-position-horizontal:absolute;mso-position-horizontal-relative:text;mso-position-vertical:absolute;mso-position-vertical-relative:text;mso-width-percent:0;mso-height-percent:0;mso-width-relative:margin;mso-height-relative:margin;v-text-anchor:top" o:gfxdata="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" strokecolor="#e00">
+              <v:shape w14:anchorId="6B276C74" id="_x0000_s1029" type="#_x0000_t202" style="position:absolute;margin-left:354.15pt;margin-top:108.9pt;width:109.3pt;height:47.65pt;z-index:251658250;visibility:visible;mso-wrap-style:square;mso-width-percent:0;mso-height-percent:0;mso-wrap-distance-left:9pt;mso-wrap-distance-top:3.6pt;mso-wrap-distance-right:9pt;mso-wrap-distance-bottom:3.6pt;mso-position-horizontal:absolute;mso-position-horizontal-relative:text;mso-position-vertical:absolute;mso-position-vertical-relative:text;mso-width-percent:0;mso-height-percent:0;mso-width-relative:margin;mso-height-relative:margin;v-text-anchor:top" o:gfxdata="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" strokecolor="#e00">
                 <v:textbox>
                   <w:txbxContent>
                     <w:p>
@@ -3043,20 +3079,19 @@
       <w:r>
         <w:rPr>
           <w:noProof/>
-          <w:color w:val="FF0000"/>
         </w:rPr>
         <mc:AlternateContent>
           <mc:Choice Requires="wps">
             <w:drawing>
-              <wp:anchor distT="0" distB="0" distL="114300" distR="114300" simplePos="0" relativeHeight="251658249" behindDoc="0" locked="0" layoutInCell="1" allowOverlap="1" wp14:anchorId="4E93D0FB" wp14:editId="5FF9CF56">
+              <wp:anchor distT="0" distB="0" distL="114300" distR="114300" simplePos="0" relativeHeight="251658249" behindDoc="0" locked="0" layoutInCell="1" allowOverlap="1" wp14:anchorId="4E93D0FB" wp14:editId="5A4F977A">
                 <wp:simplePos x="0" y="0"/>
                 <wp:positionH relativeFrom="column">
-                  <wp:posOffset>2523067</wp:posOffset>
+                  <wp:posOffset>2360295</wp:posOffset>
                 </wp:positionH>
                 <wp:positionV relativeFrom="paragraph">
-                  <wp:posOffset>1724659</wp:posOffset>
+                  <wp:posOffset>1809750</wp:posOffset>
                 </wp:positionV>
-                <wp:extent cx="219921" cy="202777"/>
+                <wp:extent cx="219710" cy="202565"/>
                 <wp:effectExtent l="0" t="0" r="27940" b="26035"/>
                 <wp:wrapNone/>
                 <wp:docPr id="2131125898" name="Rectangle 11"/>
@@ -3068,7 +3103,7 @@
                       <wps:spPr>
                         <a:xfrm>
                           <a:off x="0" y="0"/>
-                          <a:ext cx="219921" cy="202777"/>
+                          <a:ext cx="219710" cy="202565"/>
                         </a:xfrm>
                         <a:prstGeom prst="rect">
                           <a:avLst/>
@@ -3114,84 +3149,9 @@
               </wp:anchor>
             </w:drawing>
           </mc:Choice>
-          <mc:Fallback xmlns:arto="http://schemas.microsoft.com/office/word/2006/arto">
+          <mc:Fallback>
             <w:pict>
-              <v:rect w14:anchorId="5472F068" id="Rectangle 11" o:spid="_x0000_s1026" style="position:absolute;margin-left:198.65pt;margin-top:135.8pt;width:17.3pt;height:15.95pt;z-index:251672576;visibility:visible;mso-wrap-style:square;mso-width-percent:0;mso-height-percent:0;mso-wrap-distance-left:9pt;mso-wrap-distance-top:0;mso-wrap-distance-right:9pt;mso-wrap-distance-bottom:0;mso-position-horizontal:absolute;mso-position-horizontal-relative:text;mso-position-vertical:absolute;mso-position-vertical-relative:text;mso-width-percent:0;mso-height-percent:0;mso-width-relative:margin;mso-height-relative:margin;v-text-anchor:middle" o:gfxdata="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" filled="f" strokecolor="#e00" strokeweight="1.5pt"/>
-            </w:pict>
-          </mc:Fallback>
-        </mc:AlternateContent>
-      </w:r>
-      <w:r>
-        <w:rPr>
-          <w:noProof/>
-          <w:color w:val="FF0000"/>
-        </w:rPr>
-        <mc:AlternateContent>
-          <mc:Choice Requires="wps">
-            <w:drawing>
-              <wp:anchor distT="0" distB="0" distL="114300" distR="114300" simplePos="0" relativeHeight="251658248" behindDoc="0" locked="0" layoutInCell="1" allowOverlap="1" wp14:anchorId="18BA0517" wp14:editId="6DA5DAF5">
-                <wp:simplePos x="0" y="0"/>
-                <wp:positionH relativeFrom="column">
-                  <wp:posOffset>1198033</wp:posOffset>
-                </wp:positionH>
-                <wp:positionV relativeFrom="paragraph">
-                  <wp:posOffset>1441027</wp:posOffset>
-                </wp:positionV>
-                <wp:extent cx="1325034" cy="457200"/>
-                <wp:effectExtent l="0" t="0" r="27940" b="19050"/>
-                <wp:wrapNone/>
-                <wp:docPr id="576936195" name="Rectangle 11"/>
-                <wp:cNvGraphicFramePr/>
-                <a:graphic xmlns:a="http://schemas.openxmlformats.org/drawingml/2006/main">
-                  <a:graphicData uri="http://schemas.microsoft.com/office/word/2010/wordprocessingShape">
-                    <wps:wsp>
-                      <wps:cNvSpPr/>
-                      <wps:spPr>
-                        <a:xfrm>
-                          <a:off x="0" y="0"/>
-                          <a:ext cx="1325034" cy="457200"/>
-                        </a:xfrm>
-                        <a:prstGeom prst="rect">
-                          <a:avLst/>
-                        </a:prstGeom>
-                        <a:noFill/>
-                        <a:ln>
-                          <a:solidFill>
-                            <a:srgbClr val="EE0000"/>
-                          </a:solidFill>
-                        </a:ln>
-                      </wps:spPr>
-                      <wps:style>
-                        <a:lnRef idx="2">
-                          <a:schemeClr val="accent1">
-                            <a:shade val="15000"/>
-                          </a:schemeClr>
-                        </a:lnRef>
-                        <a:fillRef idx="1">
-                          <a:schemeClr val="accent1"/>
-                        </a:fillRef>
-                        <a:effectRef idx="0">
-                          <a:schemeClr val="accent1"/>
-                        </a:effectRef>
-                        <a:fontRef idx="minor">
-                          <a:schemeClr val="lt1"/>
-                        </a:fontRef>
-                      </wps:style>
-                      <wps:bodyPr rot="0" spcFirstLastPara="0" vertOverflow="overflow" horzOverflow="overflow" vert="horz" wrap="square" lIns="91440" tIns="45720" rIns="91440" bIns="45720" numCol="1" spcCol="0" rtlCol="0" fromWordArt="0" anchor="ctr" anchorCtr="0" forceAA="0" compatLnSpc="1">
-                        <a:prstTxWarp prst="textNoShape">
-                          <a:avLst/>
-                        </a:prstTxWarp>
-                        <a:noAutofit/>
-                      </wps:bodyPr>
-                    </wps:wsp>
-                  </a:graphicData>
-                </a:graphic>
-              </wp:anchor>
-            </w:drawing>
-          </mc:Choice>
-          <mc:Fallback xmlns:arto="http://schemas.microsoft.com/office/word/2006/arto">
-            <w:pict>
-              <v:rect w14:anchorId="00CDFFA0" id="Rectangle 11" o:spid="_x0000_s1026" style="position:absolute;margin-left:94.35pt;margin-top:113.45pt;width:104.35pt;height:36pt;z-index:251670528;visibility:visible;mso-wrap-style:square;mso-wrap-distance-left:9pt;mso-wrap-distance-top:0;mso-wrap-distance-right:9pt;mso-wrap-distance-bottom:0;mso-position-horizontal:absolute;mso-position-horizontal-relative:text;mso-position-vertical:absolute;mso-position-vertical-relative:text;v-text-anchor:middle" o:gfxdata="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" filled="f" strokecolor="#e00" strokeweight="1.5pt"/>
+              <v:rect w14:anchorId="59345E9D" id="Rectangle 11" o:spid="_x0000_s1026" style="position:absolute;margin-left:185.85pt;margin-top:142.5pt;width:17.3pt;height:15.95pt;z-index:251658249;visibility:visible;mso-wrap-style:square;mso-width-percent:0;mso-height-percent:0;mso-wrap-distance-left:9pt;mso-wrap-distance-top:0;mso-wrap-distance-right:9pt;mso-wrap-distance-bottom:0;mso-position-horizontal:absolute;mso-position-horizontal-relative:text;mso-position-vertical:absolute;mso-position-vertical-relative:text;mso-width-percent:0;mso-height-percent:0;mso-width-relative:margin;mso-height-relative:margin;v-text-anchor:middle" o:gfxdata="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" filled="f" strokecolor="#e00" strokeweight="1.5pt"/>
             </w:pict>
           </mc:Fallback>
         </mc:AlternateContent>
@@ -3203,13 +3163,13 @@
         <mc:AlternateContent>
           <mc:Choice Requires="wps">
             <w:drawing>
-              <wp:anchor distT="45720" distB="45720" distL="114300" distR="114300" simplePos="0" relativeHeight="251658245" behindDoc="0" locked="0" layoutInCell="1" allowOverlap="1" wp14:anchorId="03220D97" wp14:editId="494D7132">
+              <wp:anchor distT="45720" distB="45720" distL="114300" distR="114300" simplePos="0" relativeHeight="251658245" behindDoc="0" locked="0" layoutInCell="1" allowOverlap="1" wp14:anchorId="03220D97" wp14:editId="1901E5D1">
                 <wp:simplePos x="0" y="0"/>
                 <wp:positionH relativeFrom="column">
-                  <wp:posOffset>1898015</wp:posOffset>
+                  <wp:posOffset>1735455</wp:posOffset>
                 </wp:positionH>
                 <wp:positionV relativeFrom="paragraph">
-                  <wp:posOffset>2266186</wp:posOffset>
+                  <wp:posOffset>2351405</wp:posOffset>
                 </wp:positionV>
                 <wp:extent cx="1336675" cy="404495"/>
                 <wp:effectExtent l="0" t="0" r="15875" b="14605"/>
@@ -3280,7 +3240,7 @@
           </mc:Choice>
           <mc:Fallback>
             <w:pict>
-              <v:shape w14:anchorId="03220D97" id="_x0000_s1030" type="#_x0000_t202" style="position:absolute;margin-left:149.45pt;margin-top:178.45pt;width:105.25pt;height:31.85pt;z-index:251658245;visibility:visible;mso-wrap-style:square;mso-width-percent:0;mso-height-percent:0;mso-wrap-distance-left:9pt;mso-wrap-distance-top:3.6pt;mso-wrap-distance-right:9pt;mso-wrap-distance-bottom:3.6pt;mso-position-horizontal:absolute;mso-position-horizontal-relative:text;mso-position-vertical:absolute;mso-position-vertical-relative:text;mso-width-percent:0;mso-height-percent:0;mso-width-relative:margin;mso-height-relative:margin;v-text-anchor:top" o:gfxdata="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" strokecolor="#e00">
+              <v:shape w14:anchorId="03220D97" id="_x0000_s1030" type="#_x0000_t202" style="position:absolute;margin-left:136.65pt;margin-top:185.15pt;width:105.25pt;height:31.85pt;z-index:251658245;visibility:visible;mso-wrap-style:square;mso-width-percent:0;mso-height-percent:0;mso-wrap-distance-left:9pt;mso-wrap-distance-top:3.6pt;mso-wrap-distance-right:9pt;mso-wrap-distance-bottom:3.6pt;mso-position-horizontal:absolute;mso-position-horizontal-relative:text;mso-position-vertical:absolute;mso-position-vertical-relative:text;mso-width-percent:0;mso-height-percent:0;mso-width-relative:margin;mso-height-relative:margin;v-text-anchor:top" o:gfxdata="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" strokecolor="#e00">
                 <v:textbox>
                   <w:txbxContent>
                     <w:p>
@@ -3311,15 +3271,15 @@
           <w:noProof/>
         </w:rPr>
         <w:drawing>
-          <wp:anchor distT="0" distB="0" distL="114300" distR="114300" simplePos="0" relativeHeight="251658243" behindDoc="0" locked="0" layoutInCell="1" allowOverlap="1" wp14:anchorId="6D63CF77" wp14:editId="465A63D5">
+          <wp:anchor distT="0" distB="0" distL="114300" distR="114300" simplePos="0" relativeHeight="251657215" behindDoc="0" locked="0" layoutInCell="1" allowOverlap="1" wp14:anchorId="6D63CF77" wp14:editId="7543EE53">
             <wp:simplePos x="0" y="0"/>
             <wp:positionH relativeFrom="column">
-              <wp:posOffset>1197980</wp:posOffset>
+              <wp:posOffset>1035050</wp:posOffset>
             </wp:positionH>
             <wp:positionV relativeFrom="paragraph">
-              <wp:posOffset>315595</wp:posOffset>
+              <wp:posOffset>401320</wp:posOffset>
             </wp:positionV>
-            <wp:extent cx="3107848" cy="1747777"/>
+            <wp:extent cx="3107690" cy="1747520"/>
             <wp:effectExtent l="0" t="0" r="0" b="5080"/>
             <wp:wrapTopAndBottom/>
             <wp:docPr id="1712610056" name="Picture 9"/>
@@ -3336,7 +3296,7 @@
                     </pic:cNvPicPr>
                   </pic:nvPicPr>
                   <pic:blipFill>
-                    <a:blip r:embed="rId9" cstate="print">
+                    <a:blip r:embed="rId12" cstate="print">
                       <a:extLst>
                         <a:ext uri="{28A0092B-C50C-407E-A947-70E740481C1C}">
                           <a14:useLocalDpi xmlns:a14="http://schemas.microsoft.com/office/drawing/2010/main" val="0"/>
@@ -3351,7 +3311,7 @@
                   <pic:spPr bwMode="auto">
                     <a:xfrm>
                       <a:off x="0" y="0"/>
-                      <a:ext cx="3107848" cy="1747777"/>
+                      <a:ext cx="3107690" cy="1747520"/>
                     </a:xfrm>
                     <a:prstGeom prst="rect">
                       <a:avLst/>
@@ -3374,13 +3334,13 @@
         <mc:AlternateContent>
           <mc:Choice Requires="wps">
             <w:drawing>
-              <wp:anchor distT="45720" distB="45720" distL="114300" distR="114300" simplePos="0" relativeHeight="251658244" behindDoc="0" locked="0" layoutInCell="1" allowOverlap="1" wp14:anchorId="59886F08" wp14:editId="167DE4FC">
+              <wp:anchor distT="45720" distB="45720" distL="114300" distR="114300" simplePos="0" relativeHeight="251658244" behindDoc="0" locked="0" layoutInCell="1" allowOverlap="1" wp14:anchorId="59886F08" wp14:editId="6D16E9BB">
                 <wp:simplePos x="0" y="0"/>
                 <wp:positionH relativeFrom="column">
-                  <wp:posOffset>-40528</wp:posOffset>
+                  <wp:posOffset>-202051</wp:posOffset>
                 </wp:positionH>
                 <wp:positionV relativeFrom="paragraph">
-                  <wp:posOffset>2094728</wp:posOffset>
+                  <wp:posOffset>2180574</wp:posOffset>
                 </wp:positionV>
                 <wp:extent cx="1504315" cy="589915"/>
                 <wp:effectExtent l="0" t="0" r="19685" b="19685"/>
@@ -3479,7 +3439,7 @@
           </mc:Choice>
           <mc:Fallback>
             <w:pict>
-              <v:shape w14:anchorId="59886F08" id="_x0000_s1031" type="#_x0000_t202" style="position:absolute;margin-left:-3.2pt;margin-top:164.95pt;width:118.45pt;height:46.45pt;z-index:251658244;visibility:visible;mso-wrap-style:square;mso-width-percent:0;mso-height-percent:0;mso-wrap-distance-left:9pt;mso-wrap-distance-top:3.6pt;mso-wrap-distance-right:9pt;mso-wrap-distance-bottom:3.6pt;mso-position-horizontal:absolute;mso-position-horizontal-relative:text;mso-position-vertical:absolute;mso-position-vertical-relative:text;mso-width-percent:0;mso-height-percent:0;mso-width-relative:margin;mso-height-relative:margin;v-text-anchor:top" o:gfxdata="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" strokecolor="#e00">
+              <v:shape w14:anchorId="59886F08" id="_x0000_s1031" type="#_x0000_t202" style="position:absolute;margin-left:-15.9pt;margin-top:171.7pt;width:118.45pt;height:46.45pt;z-index:251658244;visibility:visible;mso-wrap-style:square;mso-width-percent:0;mso-height-percent:0;mso-wrap-distance-left:9pt;mso-wrap-distance-top:3.6pt;mso-wrap-distance-right:9pt;mso-wrap-distance-bottom:3.6pt;mso-position-horizontal:absolute;mso-position-horizontal-relative:text;mso-position-vertical:absolute;mso-position-vertical-relative:text;mso-width-percent:0;mso-height-percent:0;mso-width-relative:margin;mso-height-relative:margin;v-text-anchor:top" o:gfxdata="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" strokecolor="#e00">
                 <v:textbox>
                   <w:txbxContent>
                     <w:p>
@@ -3535,308 +3495,9 @@
       </w:r>
     </w:p>
     <w:p/>
-    <w:p>
-      <w:pPr>
-        <w:pStyle w:val="Heading3"/>
-      </w:pPr>
-      <w:r>
-        <w:t>Sand:box</w:t>
-      </w:r>
-    </w:p>
-    <w:p>
-      <w:r>
-        <w:t>Sand</w:t>
-      </w:r>
-      <w:r>
-        <w:t>:box</w:t>
-      </w:r>
-      <w:r>
-        <w:t xml:space="preserve"> is a mobile simulation game </w:t>
-      </w:r>
-      <w:r>
-        <w:t>which allows users to simulate various things in a more pixelated style, allowing for different materials</w:t>
-      </w:r>
-      <w:r>
-        <w:t xml:space="preserve"> and gravity-effected </w:t>
-      </w:r>
-      <w:r>
-        <w:t>elements.</w:t>
-      </w:r>
-    </w:p>
-    <w:p/>
-    <w:p>
-      <w:r>
-        <w:t xml:space="preserve">This game has the simple rule of gravity always pulling down, and is less about space simulations, but showcases the type of </w:t>
-      </w:r>
-      <w:r>
-        <w:t xml:space="preserve">zoom control I want. This app treats the edges of the screen as either solid barriers or </w:t>
-      </w:r>
-      <w:r>
-        <w:t>incorporeal</w:t>
-      </w:r>
-      <w:r>
-        <w:t xml:space="preserve"> (</w:t>
-      </w:r>
-      <w:r>
-        <w:t>lets gravity elements fall out of the screen</w:t>
-      </w:r>
-      <w:r>
-        <w:t>)</w:t>
-      </w:r>
-      <w:r>
-        <w:t xml:space="preserve"> but has several fixed zoom levels to pick from, and </w:t>
-      </w:r>
-      <w:r>
-        <w:t>warns users that larger sizes may negatively effect performance. I am hoping to implement the same style of fixed position simulation,</w:t>
-      </w:r>
-      <w:r>
-        <w:t xml:space="preserve"> </w:t>
-      </w:r>
-      <w:r>
-        <w:t>with no zooming in or out</w:t>
-      </w:r>
-      <w:r>
-        <w:t xml:space="preserve"> apart from defining </w:t>
-      </w:r>
-      <w:r>
-        <w:t>different scales</w:t>
-      </w:r>
-      <w:r>
-        <w:t>.</w:t>
-      </w:r>
-    </w:p>
-    <w:p>
-      <w:pPr>
-        <w:rPr>
-          <w:rFonts w:ascii="Cascadia Mono SemiBold" w:eastAsiaTheme="majorEastAsia" w:hAnsi="Cascadia Mono SemiBold" w:cstheme="majorBidi"/>
-          <w:color w:val="124F1A" w:themeColor="accent3" w:themeShade="BF"/>
-          <w:sz w:val="28"/>
-          <w:szCs w:val="28"/>
-        </w:rPr>
-      </w:pPr>
-      <w:r>
-        <w:rPr>
-          <w:noProof/>
-          <w:color w:val="FF0000"/>
-        </w:rPr>
-        <mc:AlternateContent>
-          <mc:Choice Requires="wps">
-            <w:drawing>
-              <wp:anchor distT="0" distB="0" distL="114300" distR="114300" simplePos="0" relativeHeight="251658259" behindDoc="0" locked="0" layoutInCell="1" allowOverlap="1" wp14:anchorId="320BCAE2" wp14:editId="02F10B61">
-                <wp:simplePos x="0" y="0"/>
-                <wp:positionH relativeFrom="column">
-                  <wp:posOffset>512763</wp:posOffset>
-                </wp:positionH>
-                <wp:positionV relativeFrom="paragraph">
-                  <wp:posOffset>2406650</wp:posOffset>
-                </wp:positionV>
-                <wp:extent cx="800100" cy="390525"/>
-                <wp:effectExtent l="0" t="0" r="19050" b="28575"/>
-                <wp:wrapNone/>
-                <wp:docPr id="160302255" name="Rectangle 11"/>
-                <wp:cNvGraphicFramePr/>
-                <a:graphic xmlns:a="http://schemas.openxmlformats.org/drawingml/2006/main">
-                  <a:graphicData uri="http://schemas.microsoft.com/office/word/2010/wordprocessingShape">
-                    <wps:wsp>
-                      <wps:cNvSpPr/>
-                      <wps:spPr>
-                        <a:xfrm>
-                          <a:off x="0" y="0"/>
-                          <a:ext cx="800100" cy="390525"/>
-                        </a:xfrm>
-                        <a:prstGeom prst="rect">
-                          <a:avLst/>
-                        </a:prstGeom>
-                        <a:noFill/>
-                        <a:ln>
-                          <a:solidFill>
-                            <a:srgbClr val="EE0000"/>
-                          </a:solidFill>
-                        </a:ln>
-                      </wps:spPr>
-                      <wps:style>
-                        <a:lnRef idx="2">
-                          <a:schemeClr val="accent1">
-                            <a:shade val="15000"/>
-                          </a:schemeClr>
-                        </a:lnRef>
-                        <a:fillRef idx="1">
-                          <a:schemeClr val="accent1"/>
-                        </a:fillRef>
-                        <a:effectRef idx="0">
-                          <a:schemeClr val="accent1"/>
-                        </a:effectRef>
-                        <a:fontRef idx="minor">
-                          <a:schemeClr val="lt1"/>
-                        </a:fontRef>
-                      </wps:style>
-                      <wps:bodyPr rot="0" spcFirstLastPara="0" vertOverflow="overflow" horzOverflow="overflow" vert="horz" wrap="square" lIns="91440" tIns="45720" rIns="91440" bIns="45720" numCol="1" spcCol="0" rtlCol="0" fromWordArt="0" anchor="ctr" anchorCtr="0" forceAA="0" compatLnSpc="1">
-                        <a:prstTxWarp prst="textNoShape">
-                          <a:avLst/>
-                        </a:prstTxWarp>
-                        <a:noAutofit/>
-                      </wps:bodyPr>
-                    </wps:wsp>
-                  </a:graphicData>
-                </a:graphic>
-                <wp14:sizeRelH relativeFrom="margin">
-                  <wp14:pctWidth>0</wp14:pctWidth>
-                </wp14:sizeRelH>
-                <wp14:sizeRelV relativeFrom="margin">
-                  <wp14:pctHeight>0</wp14:pctHeight>
-                </wp14:sizeRelV>
-              </wp:anchor>
-            </w:drawing>
-          </mc:Choice>
-          <mc:Fallback xmlns:arto="http://schemas.microsoft.com/office/word/2006/arto">
-            <w:pict>
-              <v:rect w14:anchorId="7DEE62E3" id="Rectangle 11" o:spid="_x0000_s1026" style="position:absolute;margin-left:40.4pt;margin-top:189.5pt;width:63pt;height:30.75pt;z-index:251689984;visibility:visible;mso-wrap-style:square;mso-width-percent:0;mso-height-percent:0;mso-wrap-distance-left:9pt;mso-wrap-distance-top:0;mso-wrap-distance-right:9pt;mso-wrap-distance-bottom:0;mso-position-horizontal:absolute;mso-position-horizontal-relative:text;mso-position-vertical:absolute;mso-position-vertical-relative:text;mso-width-percent:0;mso-height-percent:0;mso-width-relative:margin;mso-height-relative:margin;v-text-anchor:middle" o:gfxdata="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" filled="f" strokecolor="#e00" strokeweight="1.5pt"/>
-            </w:pict>
-          </mc:Fallback>
-        </mc:AlternateContent>
-      </w:r>
-      <w:r>
-        <w:rPr>
-          <w:rFonts w:ascii="Cascadia Mono SemiBold" w:eastAsiaTheme="majorEastAsia" w:hAnsi="Cascadia Mono SemiBold" w:cstheme="majorBidi"/>
-          <w:noProof/>
-          <w:color w:val="124F1A" w:themeColor="accent3" w:themeShade="BF"/>
-          <w:sz w:val="28"/>
-          <w:szCs w:val="28"/>
-        </w:rPr>
-        <w:drawing>
-          <wp:anchor distT="0" distB="0" distL="114300" distR="114300" simplePos="0" relativeHeight="251658258" behindDoc="0" locked="0" layoutInCell="1" allowOverlap="1" wp14:anchorId="4DB125D0" wp14:editId="7907E522">
-            <wp:simplePos x="0" y="0"/>
-            <wp:positionH relativeFrom="column">
-              <wp:posOffset>1845310</wp:posOffset>
-            </wp:positionH>
-            <wp:positionV relativeFrom="paragraph">
-              <wp:posOffset>222250</wp:posOffset>
-            </wp:positionV>
-            <wp:extent cx="1794510" cy="3985895"/>
-            <wp:effectExtent l="0" t="0" r="0" b="0"/>
-            <wp:wrapTopAndBottom/>
-            <wp:docPr id="1795535373" name="Picture 21"/>
-            <wp:cNvGraphicFramePr>
-              <a:graphicFrameLocks xmlns:a="http://schemas.openxmlformats.org/drawingml/2006/main" noChangeAspect="1"/>
-            </wp:cNvGraphicFramePr>
-            <a:graphic xmlns:a="http://schemas.openxmlformats.org/drawingml/2006/main">
-              <a:graphicData uri="http://schemas.openxmlformats.org/drawingml/2006/picture">
-                <pic:pic xmlns:pic="http://schemas.openxmlformats.org/drawingml/2006/picture">
-                  <pic:nvPicPr>
-                    <pic:cNvPr id="0" name="Picture 2"/>
-                    <pic:cNvPicPr>
-                      <a:picLocks noChangeAspect="1" noChangeArrowheads="1"/>
-                    </pic:cNvPicPr>
-                  </pic:nvPicPr>
-                  <pic:blipFill>
-                    <a:blip r:embed="rId10" cstate="print">
-                      <a:extLst>
-                        <a:ext uri="{28A0092B-C50C-407E-A947-70E740481C1C}">
-                          <a14:useLocalDpi xmlns:a14="http://schemas.microsoft.com/office/drawing/2010/main" val="0"/>
-                        </a:ext>
-                      </a:extLst>
-                    </a:blip>
-                    <a:srcRect/>
-                    <a:stretch>
-                      <a:fillRect/>
-                    </a:stretch>
-                  </pic:blipFill>
-                  <pic:spPr bwMode="auto">
-                    <a:xfrm flipH="1">
-                      <a:off x="0" y="0"/>
-                      <a:ext cx="1794510" cy="3985895"/>
-                    </a:xfrm>
-                    <a:prstGeom prst="rect">
-                      <a:avLst/>
-                    </a:prstGeom>
-                    <a:noFill/>
-                    <a:ln>
-                      <a:noFill/>
-                    </a:ln>
-                  </pic:spPr>
-                </pic:pic>
-              </a:graphicData>
-            </a:graphic>
-            <wp14:sizeRelH relativeFrom="margin">
-              <wp14:pctWidth>0</wp14:pctWidth>
-            </wp14:sizeRelH>
-            <wp14:sizeRelV relativeFrom="margin">
-              <wp14:pctHeight>0</wp14:pctHeight>
-            </wp14:sizeRelV>
-          </wp:anchor>
-        </w:drawing>
-      </w:r>
-      <w:r>
-        <w:rPr>
-          <w:noProof/>
-        </w:rPr>
-        <w:drawing>
-          <wp:anchor distT="0" distB="0" distL="114300" distR="114300" simplePos="0" relativeHeight="251658257" behindDoc="0" locked="0" layoutInCell="1" allowOverlap="1" wp14:anchorId="3EB27426" wp14:editId="744E405B">
-            <wp:simplePos x="0" y="0"/>
-            <wp:positionH relativeFrom="column">
-              <wp:posOffset>8255</wp:posOffset>
-            </wp:positionH>
-            <wp:positionV relativeFrom="paragraph">
-              <wp:posOffset>222250</wp:posOffset>
-            </wp:positionV>
-            <wp:extent cx="1794510" cy="3985895"/>
-            <wp:effectExtent l="0" t="0" r="0" b="0"/>
-            <wp:wrapTopAndBottom/>
-            <wp:docPr id="476934748" name="Picture 20"/>
-            <wp:cNvGraphicFramePr>
-              <a:graphicFrameLocks xmlns:a="http://schemas.openxmlformats.org/drawingml/2006/main" noChangeAspect="1"/>
-            </wp:cNvGraphicFramePr>
-            <a:graphic xmlns:a="http://schemas.openxmlformats.org/drawingml/2006/main">
-              <a:graphicData uri="http://schemas.openxmlformats.org/drawingml/2006/picture">
-                <pic:pic xmlns:pic="http://schemas.openxmlformats.org/drawingml/2006/picture">
-                  <pic:nvPicPr>
-                    <pic:cNvPr id="0" name="Picture 1"/>
-                    <pic:cNvPicPr>
-                      <a:picLocks noChangeAspect="1" noChangeArrowheads="1"/>
-                    </pic:cNvPicPr>
-                  </pic:nvPicPr>
-                  <pic:blipFill>
-                    <a:blip r:embed="rId11" cstate="print">
-                      <a:extLst>
-                        <a:ext uri="{28A0092B-C50C-407E-A947-70E740481C1C}">
-                          <a14:useLocalDpi xmlns:a14="http://schemas.microsoft.com/office/drawing/2010/main" val="0"/>
-                        </a:ext>
-                      </a:extLst>
-                    </a:blip>
-                    <a:srcRect/>
-                    <a:stretch>
-                      <a:fillRect/>
-                    </a:stretch>
-                  </pic:blipFill>
-                  <pic:spPr bwMode="auto">
-                    <a:xfrm>
-                      <a:off x="0" y="0"/>
-                      <a:ext cx="1794510" cy="3985895"/>
-                    </a:xfrm>
-                    <a:prstGeom prst="rect">
-                      <a:avLst/>
-                    </a:prstGeom>
-                    <a:noFill/>
-                    <a:ln>
-                      <a:noFill/>
-                    </a:ln>
-                  </pic:spPr>
-                </pic:pic>
-              </a:graphicData>
-            </a:graphic>
-            <wp14:sizeRelH relativeFrom="margin">
-              <wp14:pctWidth>0</wp14:pctWidth>
-            </wp14:sizeRelH>
-            <wp14:sizeRelV relativeFrom="margin">
-              <wp14:pctHeight>0</wp14:pctHeight>
-            </wp14:sizeRelV>
-          </wp:anchor>
-        </w:drawing>
-      </w:r>
-    </w:p>
     <w:sectPr>
-      <w:headerReference w:type="default" r:id="rId12"/>
-      <w:footerReference w:type="default" r:id="rId13"/>
+      <w:headerReference w:type="default" r:id="rId13"/>
+      <w:footerReference w:type="default" r:id="rId14"/>
       <w:pgSz w:w="11906" w:h="16838"/>
       <w:pgMar w:top="1440" w:right="1440" w:bottom="1440" w:left="1440" w:header="708" w:footer="708" w:gutter="0"/>
       <w:pgNumType w:start="0"/>
@@ -3883,6 +3544,7 @@
         <w:docPartUnique/>
       </w:docPartObj>
     </w:sdtPr>
+    <w:sdtEndPr/>
     <w:sdtContent>
       <w:sdt>
         <w:sdtPr>
@@ -3892,6 +3554,7 @@
             <w:docPartUnique/>
           </w:docPartObj>
         </w:sdtPr>
+        <w:sdtEndPr/>
         <w:sdtContent>
           <w:p>
             <w:pPr>
@@ -5661,7 +5324,12 @@
 </file>
 
 <file path=customXml/item1.xml><?xml version="1.0" encoding="utf-8"?>
-<b:Sources xmlns:b="http://schemas.openxmlformats.org/officeDocument/2006/bibliography" xmlns="http://schemas.openxmlformats.org/officeDocument/2006/bibliography" SelectedStyle="\APASixthEditionOfficeOnline.xsl" StyleName="APA" Version="6"/>
+<?mso-contentType ?>
+<FormTemplates xmlns="http://schemas.microsoft.com/sharepoint/v3/contenttype/forms">
+  <Display>DocumentLibraryForm</Display>
+  <Edit>DocumentLibraryForm</Edit>
+  <New>DocumentLibraryForm</New>
+</FormTemplates>
 </file>
 
 <file path=customXml/item2.xml><?xml version="1.0" encoding="utf-8"?>
@@ -5854,12 +5522,7 @@
 </file>
 
 <file path=customXml/item3.xml><?xml version="1.0" encoding="utf-8"?>
-<?mso-contentType ?>
-<FormTemplates xmlns="http://schemas.microsoft.com/sharepoint/v3/contenttype/forms">
-  <Display>DocumentLibraryForm</Display>
-  <Edit>DocumentLibraryForm</Edit>
-  <New>DocumentLibraryForm</New>
-</FormTemplates>
+<b:Sources xmlns:b="http://schemas.openxmlformats.org/officeDocument/2006/bibliography" xmlns="http://schemas.openxmlformats.org/officeDocument/2006/bibliography" SelectedStyle="\APASixthEditionOfficeOnline.xsl" StyleName="APA" Version="6"/>
 </file>
 
 <file path=customXml/item4.xml><?xml version="1.0" encoding="utf-8"?>
@@ -5874,6 +5537,33 @@
 </file>
 
 <file path=customXml/itemProps1.xml><?xml version="1.0" encoding="utf-8"?>
+<ds:datastoreItem xmlns:ds="http://schemas.openxmlformats.org/officeDocument/2006/customXml" ds:itemID="{9128A5A1-6475-4B32-BB91-47A4FCB26C7F}">
+  <ds:schemaRefs>
+    <ds:schemaRef ds:uri="http://schemas.microsoft.com/sharepoint/v3/contenttype/forms"/>
+  </ds:schemaRefs>
+</ds:datastoreItem>
+</file>
+
+<file path=customXml/itemProps2.xml><?xml version="1.0" encoding="utf-8"?>
+<ds:datastoreItem xmlns:ds="http://schemas.openxmlformats.org/officeDocument/2006/customXml" ds:itemID="{0FBB64CD-4708-4904-81F4-B397F994F437}">
+  <ds:schemaRefs>
+    <ds:schemaRef ds:uri="http://schemas.microsoft.com/office/2006/metadata/contentType"/>
+    <ds:schemaRef ds:uri="http://schemas.microsoft.com/office/2006/metadata/properties/metaAttributes"/>
+    <ds:schemaRef ds:uri="http://www.w3.org/2001/XMLSchema"/>
+    <ds:schemaRef ds:uri="http://schemas.microsoft.com/office/2006/metadata/properties"/>
+    <ds:schemaRef ds:uri="7ee41aa2-a9ad-41d9-b8b1-bb01358df394"/>
+    <ds:schemaRef ds:uri="cc0e8f53-4a54-4e8b-83c1-d15ba22c3663"/>
+    <ds:schemaRef ds:uri="http://schemas.microsoft.com/office/2006/documentManagement/types"/>
+    <ds:schemaRef ds:uri="http://schemas.microsoft.com/office/infopath/2007/PartnerControls"/>
+    <ds:schemaRef ds:uri="http://schemas.openxmlformats.org/package/2006/metadata/core-properties"/>
+    <ds:schemaRef ds:uri="http://purl.org/dc/elements/1.1/"/>
+    <ds:schemaRef ds:uri="http://purl.org/dc/terms/"/>
+    <ds:schemaRef ds:uri="http://schemas.microsoft.com/internal/obd"/>
+  </ds:schemaRefs>
+</ds:datastoreItem>
+</file>
+
+<file path=customXml/itemProps3.xml><?xml version="1.0" encoding="utf-8"?>
 <ds:datastoreItem xmlns:ds="http://schemas.openxmlformats.org/officeDocument/2006/customXml" ds:itemID="{5902FAF7-2D96-44F4-AD49-ED5DFC446DB7}">
   <ds:schemaRefs>
     <ds:schemaRef ds:uri="http://schemas.openxmlformats.org/officeDocument/2006/bibliography"/>
@@ -5881,14 +5571,13 @@
 </ds:datastoreItem>
 </file>
 
-<file path=customXml/itemProps2.xml><?xml version="1.0" encoding="utf-8"?>
-<ds:datastoreItem xmlns:ds="http://schemas.openxmlformats.org/officeDocument/2006/customXml" ds:itemID="{0FBB64CD-4708-4904-81F4-B397F994F437}"/>
-</file>
-
-<file path=customXml/itemProps3.xml><?xml version="1.0" encoding="utf-8"?>
-<ds:datastoreItem xmlns:ds="http://schemas.openxmlformats.org/officeDocument/2006/customXml" ds:itemID="{9128A5A1-6475-4B32-BB91-47A4FCB26C7F}"/>
-</file>
-
 <file path=customXml/itemProps4.xml><?xml version="1.0" encoding="utf-8"?>
-<ds:datastoreItem xmlns:ds="http://schemas.openxmlformats.org/officeDocument/2006/customXml" ds:itemID="{82903C00-DB16-4522-BDA6-A6E2F7862959}"/>
+<ds:datastoreItem xmlns:ds="http://schemas.openxmlformats.org/officeDocument/2006/customXml" ds:itemID="{82903C00-DB16-4522-BDA6-A6E2F7862959}">
+  <ds:schemaRefs>
+    <ds:schemaRef ds:uri="http://schemas.microsoft.com/office/2006/metadata/properties"/>
+    <ds:schemaRef ds:uri="http://schemas.microsoft.com/office/infopath/2007/PartnerControls"/>
+    <ds:schemaRef ds:uri="cc0e8f53-4a54-4e8b-83c1-d15ba22c3663"/>
+    <ds:schemaRef ds:uri="7ee41aa2-a9ad-41d9-b8b1-bb01358df394"/>
+  </ds:schemaRefs>
+</ds:datastoreItem>
 </file>
</xml_diff>